<commit_message>
feat: update template and coordinates from new DOCX - so_gttt now has 138pt gap before Ngày cấp
</commit_message>
<xml_diff>
--- a/upload/template.docx
+++ b/upload/template.docx
@@ -61,7 +61,7 @@
                               <w:jc w:val="center"/>
                               <w:outlineLvl w:val="2"/>
                               <w:rPr>
-                                <w:rFonts w:ascii="Arial" w:hAnsi="Arial"/>
+                                <w:rFonts w:ascii="Times New Roman" w:hAnsi="Times New Roman"/>
                                 <w:b/>
                                 <w:sz w:val="48"/>
                                 <w:szCs w:val="48"/>
@@ -70,7 +70,7 @@
                             </w:pPr>
                             <w:r>
                               <w:rPr>
-                                <w:rFonts w:ascii="Arial" w:hAnsi="Arial"/>
+                                <w:rFonts w:ascii="Times New Roman" w:hAnsi="Times New Roman"/>
                                 <w:b/>
                                 <w:sz w:val="48"/>
                                 <w:szCs w:val="48"/>
@@ -83,6 +83,9 @@
                             <w:pPr>
                               <w:spacing w:before="120" w:after="120"/>
                               <w:jc w:val="center"/>
+                              <w:rPr>
+                                <w:rFonts w:ascii="Times New Roman" w:hAnsi="Times New Roman"/>
+                              </w:rPr>
                             </w:pPr>
                             <w:r>
                               <w:rPr>
@@ -94,6 +97,9 @@
                               <w:t>(Số GYCBH/HĐBH: …………………….</w:t>
                             </w:r>
                             <w:r>
+                              <w:rPr>
+                                <w:rFonts w:ascii="Times New Roman" w:hAnsi="Times New Roman"/>
+                              </w:rPr>
                               <w:t>)</w:t>
                             </w:r>
                           </w:p>
@@ -180,16 +186,22 @@
                               <w:t xml:space="preserve"> Ngày/tháng/năm sinh: </w:t>
                             </w:r>
                             <w:r>
-                              <w:t xml:space="preserve"> </w:t>
+                              <w:rPr>
+                                <w:rFonts w:ascii="Times New Roman" w:hAnsi="Times New Roman"/>
+                              </w:rPr>
+                              <w:t xml:space="preserve"> {ngay_sinh}            </w:t>
                             </w:r>
                             <w:r>
                               <w:rPr>
-                                <w:rFonts w:ascii="Calibri" w:hAnsi="Calibri" w:cs="Calibri"/>
+                                <w:rFonts w:ascii="Times New Roman" w:hAnsi="Times New Roman"/>
                               </w:rPr>
-                              <w:t>{ngay_sinh}</w:t>
+                              <w:t xml:space="preserve">   </w:t>
                             </w:r>
                             <w:r>
-                              <w:t xml:space="preserve">               </w:t>
+                              <w:rPr>
+                                <w:rFonts w:ascii="Times New Roman" w:hAnsi="Times New Roman"/>
+                              </w:rPr>
+                              <w:t xml:space="preserve">   </w:t>
                             </w:r>
                             <w:r>
                               <w:rPr>
@@ -202,7 +214,7 @@
                             </w:r>
                             <w:r>
                               <w:rPr>
-                                <w:rFonts w:ascii="Calibri" w:eastAsia="MS Gothic" w:hAnsi="Calibri" w:cs="Calibri"/>
+                                <w:rFonts w:ascii="Times New Roman" w:eastAsia="MS Gothic" w:hAnsi="Times New Roman"/>
                                 <w:sz w:val="26"/>
                                 <w:szCs w:val="26"/>
                                 <w:lang w:val="fr-FR"/>
@@ -214,7 +226,7 @@
                             <w:pPr>
                               <w:spacing w:before="120" w:after="60" w:line="276" w:lineRule="auto"/>
                               <w:rPr>
-                                <w:rFonts w:ascii="Calibri" w:hAnsi="Calibri" w:cs="Calibri"/>
+                                <w:rFonts w:ascii="Times New Roman" w:hAnsi="Times New Roman"/>
                                 <w:sz w:val="26"/>
                                 <w:szCs w:val="26"/>
                                 <w:lang w:val="fr-FR"/>
@@ -231,13 +243,28 @@
                             </w:r>
                             <w:r>
                               <w:rPr>
-                                <w:rFonts w:ascii="Calibri" w:hAnsi="Calibri" w:cs="Calibri"/>
+                                <w:rFonts w:ascii="Times New Roman" w:hAnsi="Times New Roman"/>
                               </w:rPr>
                               <w:t>{sdt}</w:t>
                             </w:r>
                             <w:r>
+                              <w:rPr>
+                                <w:rFonts w:ascii="Times New Roman" w:hAnsi="Times New Roman"/>
+                              </w:rPr>
                               <w:tab/>
-                              <w:t xml:space="preserve">                       </w:t>
+                              <w:t xml:space="preserve">                  </w:t>
+                            </w:r>
+                            <w:r>
+                              <w:rPr>
+                                <w:rFonts w:ascii="Times New Roman" w:hAnsi="Times New Roman"/>
+                              </w:rPr>
+                              <w:t xml:space="preserve">    </w:t>
+                            </w:r>
+                            <w:r>
+                              <w:rPr>
+                                <w:rFonts w:ascii="Times New Roman" w:hAnsi="Times New Roman"/>
+                              </w:rPr>
+                              <w:t xml:space="preserve">     </w:t>
                             </w:r>
                             <w:r>
                               <w:rPr>
@@ -249,6 +276,9 @@
                               <w:t>Địa chỉ: {dia_chi}</w:t>
                             </w:r>
                             <w:r>
+                              <w:rPr>
+                                <w:rFonts w:ascii="Times New Roman" w:hAnsi="Times New Roman"/>
+                              </w:rPr>
                               <w:tab/>
                             </w:r>
                           </w:p>
@@ -338,7 +368,7 @@
                         <w:jc w:val="center"/>
                         <w:outlineLvl w:val="2"/>
                         <w:rPr>
-                          <w:rFonts w:ascii="Arial" w:hAnsi="Arial"/>
+                          <w:rFonts w:ascii="Times New Roman" w:hAnsi="Times New Roman"/>
                           <w:b/>
                           <w:sz w:val="48"/>
                           <w:szCs w:val="48"/>
@@ -347,7 +377,7 @@
                       </w:pPr>
                       <w:r>
                         <w:rPr>
-                          <w:rFonts w:ascii="Arial" w:hAnsi="Arial"/>
+                          <w:rFonts w:ascii="Times New Roman" w:hAnsi="Times New Roman"/>
                           <w:b/>
                           <w:sz w:val="48"/>
                           <w:szCs w:val="48"/>
@@ -360,6 +390,9 @@
                       <w:pPr>
                         <w:spacing w:before="120" w:after="120"/>
                         <w:jc w:val="center"/>
+                        <w:rPr>
+                          <w:rFonts w:ascii="Times New Roman" w:hAnsi="Times New Roman"/>
+                        </w:rPr>
                       </w:pPr>
                       <w:r>
                         <w:rPr>
@@ -371,6 +404,9 @@
                         <w:t>(Số GYCBH/HĐBH: …………………….</w:t>
                       </w:r>
                       <w:r>
+                        <w:rPr>
+                          <w:rFonts w:ascii="Times New Roman" w:hAnsi="Times New Roman"/>
+                        </w:rPr>
                         <w:t>)</w:t>
                       </w:r>
                     </w:p>
@@ -457,16 +493,22 @@
                         <w:t xml:space="preserve"> Ngày/tháng/năm sinh: </w:t>
                       </w:r>
                       <w:r>
-                        <w:t xml:space="preserve"> </w:t>
+                        <w:rPr>
+                          <w:rFonts w:ascii="Times New Roman" w:hAnsi="Times New Roman"/>
+                        </w:rPr>
+                        <w:t xml:space="preserve"> {ngay_sinh}            </w:t>
                       </w:r>
                       <w:r>
                         <w:rPr>
-                          <w:rFonts w:ascii="Calibri" w:hAnsi="Calibri" w:cs="Calibri"/>
+                          <w:rFonts w:ascii="Times New Roman" w:hAnsi="Times New Roman"/>
                         </w:rPr>
-                        <w:t>{ngay_sinh}</w:t>
+                        <w:t xml:space="preserve">   </w:t>
                       </w:r>
                       <w:r>
-                        <w:t xml:space="preserve">               </w:t>
+                        <w:rPr>
+                          <w:rFonts w:ascii="Times New Roman" w:hAnsi="Times New Roman"/>
+                        </w:rPr>
+                        <w:t xml:space="preserve">   </w:t>
                       </w:r>
                       <w:r>
                         <w:rPr>
@@ -479,7 +521,7 @@
                       </w:r>
                       <w:r>
                         <w:rPr>
-                          <w:rFonts w:ascii="Calibri" w:eastAsia="MS Gothic" w:hAnsi="Calibri" w:cs="Calibri"/>
+                          <w:rFonts w:ascii="Times New Roman" w:eastAsia="MS Gothic" w:hAnsi="Times New Roman"/>
                           <w:sz w:val="26"/>
                           <w:szCs w:val="26"/>
                           <w:lang w:val="fr-FR"/>
@@ -491,7 +533,7 @@
                       <w:pPr>
                         <w:spacing w:before="120" w:after="60" w:line="276" w:lineRule="auto"/>
                         <w:rPr>
-                          <w:rFonts w:ascii="Calibri" w:hAnsi="Calibri" w:cs="Calibri"/>
+                          <w:rFonts w:ascii="Times New Roman" w:hAnsi="Times New Roman"/>
                           <w:sz w:val="26"/>
                           <w:szCs w:val="26"/>
                           <w:lang w:val="fr-FR"/>
@@ -508,13 +550,28 @@
                       </w:r>
                       <w:r>
                         <w:rPr>
-                          <w:rFonts w:ascii="Calibri" w:hAnsi="Calibri" w:cs="Calibri"/>
+                          <w:rFonts w:ascii="Times New Roman" w:hAnsi="Times New Roman"/>
                         </w:rPr>
                         <w:t>{sdt}</w:t>
                       </w:r>
                       <w:r>
+                        <w:rPr>
+                          <w:rFonts w:ascii="Times New Roman" w:hAnsi="Times New Roman"/>
+                        </w:rPr>
                         <w:tab/>
-                        <w:t xml:space="preserve">                       </w:t>
+                        <w:t xml:space="preserve">                  </w:t>
+                      </w:r>
+                      <w:r>
+                        <w:rPr>
+                          <w:rFonts w:ascii="Times New Roman" w:hAnsi="Times New Roman"/>
+                        </w:rPr>
+                        <w:t xml:space="preserve">    </w:t>
+                      </w:r>
+                      <w:r>
+                        <w:rPr>
+                          <w:rFonts w:ascii="Times New Roman" w:hAnsi="Times New Roman"/>
+                        </w:rPr>
+                        <w:t xml:space="preserve">     </w:t>
                       </w:r>
                       <w:r>
                         <w:rPr>
@@ -526,6 +583,9 @@
                         <w:t>Địa chỉ: {dia_chi}</w:t>
                       </w:r>
                       <w:r>
+                        <w:rPr>
+                          <w:rFonts w:ascii="Times New Roman" w:hAnsi="Times New Roman"/>
+                        </w:rPr>
                         <w:tab/>
                       </w:r>
                     </w:p>
@@ -754,16 +814,7 @@
                                 <w:sz w:val="26"/>
                                 <w:szCs w:val="26"/>
                               </w:rPr>
-                              <w:t xml:space="preserve">CÔNG </w:t>
-                            </w:r>
-                            <w:r>
-                              <w:rPr>
-                                <w:rFonts w:ascii="Times New Roman" w:hAnsi="Times New Roman"/>
-                                <w:b/>
-                                <w:sz w:val="26"/>
-                                <w:szCs w:val="26"/>
-                              </w:rPr>
-                              <w:t xml:space="preserve">TY: </w:t>
+                              <w:t xml:space="preserve">CÔNG TY: </w:t>
                             </w:r>
                             <w:r>
                               <w:rPr>
@@ -845,16 +896,7 @@
                           <w:sz w:val="26"/>
                           <w:szCs w:val="26"/>
                         </w:rPr>
-                        <w:t xml:space="preserve">CÔNG </w:t>
-                      </w:r>
-                      <w:r>
-                        <w:rPr>
-                          <w:rFonts w:ascii="Times New Roman" w:hAnsi="Times New Roman"/>
-                          <w:b/>
-                          <w:sz w:val="26"/>
-                          <w:szCs w:val="26"/>
-                        </w:rPr>
-                        <w:t xml:space="preserve">TY: </w:t>
+                        <w:t xml:space="preserve">CÔNG TY: </w:t>
                       </w:r>
                       <w:r>
                         <w:rPr>
@@ -1098,16 +1140,25 @@
           <w:szCs w:val="26"/>
           <w:lang w:val="fr-FR"/>
         </w:rPr>
-        <w:t xml:space="preserve">{ngay_sinh}.                 </w:t>
-      </w:r>
-      <w:r>
-        <w:rPr>
-          <w:rFonts w:ascii="Times New Roman" w:hAnsi="Times New Roman"/>
-          <w:sz w:val="24"/>
-          <w:szCs w:val="24"/>
+        <w:t xml:space="preserve">{ngay_sinh}.   </w:t>
+      </w:r>
+      <w:r>
+        <w:rPr>
+          <w:rFonts w:ascii="Times New Roman" w:hAnsi="Times New Roman"/>
+          <w:sz w:val="26"/>
+          <w:szCs w:val="26"/>
           <w:lang w:val="fr-FR"/>
         </w:rPr>
-        <w:t xml:space="preserve"> Giới tính: </w:t>
+        <w:t xml:space="preserve">                </w:t>
+      </w:r>
+      <w:r>
+        <w:rPr>
+          <w:rFonts w:ascii="Times New Roman" w:hAnsi="Times New Roman"/>
+          <w:sz w:val="24"/>
+          <w:szCs w:val="24"/>
+          <w:lang w:val="fr-FR"/>
+        </w:rPr>
+        <w:t xml:space="preserve">Giới tính: </w:t>
       </w:r>
       <w:r>
         <w:rPr>
@@ -1181,7 +1232,25 @@
           <w:szCs w:val="24"/>
           <w:lang w:val="fr-FR"/>
         </w:rPr>
-        <w:t xml:space="preserve">                    Ngày cấp:  </w:t>
+        <w:t xml:space="preserve">               </w:t>
+      </w:r>
+      <w:r>
+        <w:rPr>
+          <w:rFonts w:ascii="Times New Roman" w:hAnsi="Times New Roman"/>
+          <w:sz w:val="24"/>
+          <w:szCs w:val="24"/>
+          <w:lang w:val="fr-FR"/>
+        </w:rPr>
+        <w:t xml:space="preserve">           </w:t>
+      </w:r>
+      <w:r>
+        <w:rPr>
+          <w:rFonts w:ascii="Times New Roman" w:hAnsi="Times New Roman"/>
+          <w:sz w:val="24"/>
+          <w:szCs w:val="24"/>
+          <w:lang w:val="fr-FR"/>
+        </w:rPr>
+        <w:t xml:space="preserve">     Ngày cấp:  </w:t>
       </w:r>
       <w:r>
         <w:rPr>
@@ -1347,6 +1416,12 @@
       </w:r>
       <w:r>
         <w:rPr>
+          <w:rFonts w:asciiTheme="minorHAnsi" w:hAnsiTheme="minorHAnsi" w:cstheme="minorHAnsi"/>
+        </w:rPr>
+        <w:t xml:space="preserve">   </w:t>
+      </w:r>
+      <w:r>
+        <w:rPr>
           <w:rFonts w:ascii="Times New Roman" w:hAnsi="Times New Roman"/>
           <w:sz w:val="24"/>
           <w:szCs w:val="24"/>
@@ -1433,6 +1508,14 @@
       </w:r>
       <w:r>
         <w:tab/>
+      </w:r>
+      <w:r>
+        <w:rPr>
+          <w:rFonts w:asciiTheme="minorHAnsi" w:hAnsiTheme="minorHAnsi" w:cstheme="minorHAnsi"/>
+        </w:rPr>
+        <w:t xml:space="preserve">    </w:t>
+      </w:r>
+      <w:r>
         <w:t xml:space="preserve"> </w:t>
       </w:r>
       <w:r>
@@ -1508,15 +1591,7 @@
           <w:sz w:val="24"/>
           <w:szCs w:val="24"/>
         </w:rPr>
-        <w:t xml:space="preserve">4. Quan hệ với Người được kiểm tra sức khỏe:  </w:t>
-      </w:r>
-      <w:r>
-        <w:rPr>
-          <w:rFonts w:ascii="Times New Roman" w:hAnsi="Times New Roman"/>
-          <w:sz w:val="24"/>
-          <w:szCs w:val="24"/>
-        </w:rPr>
-        <w:t xml:space="preserve"> </w:t>
+        <w:t xml:space="preserve">4. Quan hệ với Người được kiểm tra sức khỏe:   </w:t>
       </w:r>
       <w:r>
         <w:rPr>
@@ -3820,24 +3895,24 @@
           <w:rFonts w:ascii="Times New Roman" w:hAnsi="Times New Roman"/>
           <w:sz w:val="24"/>
           <w:szCs w:val="24"/>
-        </w:rPr>
-      </w:pPr>
-      <w:r>
-        <w:rPr>
-          <w:rFonts w:ascii="Times New Roman" w:hAnsi="Times New Roman"/>
-          <w:sz w:val="24"/>
-          <w:szCs w:val="24"/>
-        </w:rPr>
-        <w:t xml:space="preserve">Nội dung cần kiểm tra bổ sung: </w:t>
-      </w:r>
-      <w:r>
-        <w:rPr>
-          <w:rFonts w:ascii="Times New Roman" w:hAnsi="Times New Roman"/>
-          <w:sz w:val="24"/>
-          <w:szCs w:val="24"/>
-        </w:rPr>
-        <w:tab/>
-        <w:t>{ghi_chu}</w:t>
+          <w:lang w:val="vi-VN"/>
+        </w:rPr>
+      </w:pPr>
+      <w:r>
+        <w:rPr>
+          <w:rFonts w:ascii="Times New Roman" w:hAnsi="Times New Roman"/>
+          <w:sz w:val="24"/>
+          <w:szCs w:val="24"/>
+        </w:rPr>
+        <w:t>Nội dung cần kiểm tra bổ sung:</w:t>
+      </w:r>
+      <w:r>
+        <w:rPr>
+          <w:rFonts w:ascii="Times New Roman" w:hAnsi="Times New Roman"/>
+          <w:sz w:val="24"/>
+          <w:szCs w:val="24"/>
+        </w:rPr>
+        <w:t xml:space="preserve">  {ghi_chu}</w:t>
       </w:r>
     </w:p>
     <w:p>
@@ -9147,15 +9222,26 @@
         <w:jc w:val="center"/>
       </w:pPr>
     </w:p>
+    <w:p>
+      <w:pPr>
+        <w:rPr>
+          <w:rFonts w:asciiTheme="minorHAnsi" w:hAnsiTheme="minorHAnsi"/>
+          <w:lang w:val="vi-VN"/>
+        </w:rPr>
+      </w:pPr>
+    </w:p>
+    <w:p/>
+    <w:p>
+      <w:pPr>
+        <w:rPr>
+          <w:rFonts w:asciiTheme="minorHAnsi" w:hAnsiTheme="minorHAnsi"/>
+          <w:lang w:val="vi-VN"/>
+        </w:rPr>
+      </w:pPr>
+    </w:p>
     <w:p/>
     <w:p/>
     <w:p/>
-    <w:p/>
-    <w:p/>
-    <w:p/>
-    <w:p/>
-    <w:p/>
-    <w:p/>
     <w:p>
       <w:pPr>
         <w:rPr>
@@ -9192,7 +9278,6 @@
           <w:sz w:val="18"/>
           <w:szCs w:val="18"/>
         </w:rPr>
-        <w:lastRenderedPageBreak/>
         <w:t>Ghi chú:</w:t>
       </w:r>
     </w:p>
@@ -9424,6 +9509,322 @@
 <file path=word/numbering.xml><?xml version="1.0" encoding="utf-8"?>
 <w:numbering xmlns:wpc="http://schemas.microsoft.com/office/word/2010/wordprocessingCanvas" xmlns:cx="http://schemas.microsoft.com/office/drawing/2014/chartex" xmlns:cx1="http://schemas.microsoft.com/office/drawing/2015/9/8/chartex" xmlns:cx2="http://schemas.microsoft.com/office/drawing/2015/10/21/chartex" xmlns:cx3="http://schemas.microsoft.com/office/drawing/2016/5/9/chartex" xmlns:cx4="http://schemas.microsoft.com/office/drawing/2016/5/10/chartex" xmlns:cx5="http://schemas.microsoft.com/office/drawing/2016/5/11/chartex" xmlns:cx6="http://schemas.microsoft.com/office/drawing/2016/5/12/chartex" xmlns:cx7="http://schemas.microsoft.com/office/drawing/2016/5/13/chartex" xmlns:cx8="http://schemas.microsoft.com/office/drawing/2016/5/14/chartex" xmlns:mc="http://schemas.openxmlformats.org/markup-compatibility/2006" xmlns:aink="http://schemas.microsoft.com/office/drawing/2016/ink" xmlns:am3d="http://schemas.microsoft.com/office/drawing/2017/model3d" xmlns:o="urn:schemas-microsoft-com:office:office" xmlns:oel="http://schemas.microsoft.com/office/2019/extlst" xmlns:r="http://schemas.openxmlformats.org/officeDocument/2006/relationships" xmlns:m="http://schemas.openxmlformats.org/officeDocument/2006/math" xmlns:v="urn:schemas-microsoft-com:vml" xmlns:wp14="http://schemas.microsoft.com/office/word/2010/wordprocessingDrawing" xmlns:wp="http://schemas.openxmlformats.org/drawingml/2006/wordprocessingDrawing" xmlns:w10="urn:schemas-microsoft-com:office:word" xmlns:w="http://schemas.openxmlformats.org/wordprocessingml/2006/main" xmlns:w14="http://schemas.microsoft.com/office/word/2010/wordml" xmlns:w15="http://schemas.microsoft.com/office/word/2012/wordml" xmlns:w16cex="http://schemas.microsoft.com/office/word/2018/wordml/cex" xmlns:w16cid="http://schemas.microsoft.com/office/word/2016/wordml/cid" xmlns:w16="http://schemas.microsoft.com/office/word/2018/wordml" xmlns:w16du="http://schemas.microsoft.com/office/word/2023/wordml/word16du" xmlns:w16sdtdh="http://schemas.microsoft.com/office/word/2020/wordml/sdtdatahash" xmlns:w16sdtfl="http://schemas.microsoft.com/office/word/2024/wordml/sdtformatlock" xmlns:w16se="http://schemas.microsoft.com/office/word/2015/wordml/symex" xmlns:wpg="http://schemas.microsoft.com/office/word/2010/wordprocessingGroup" xmlns:wpi="http://schemas.microsoft.com/office/word/2010/wordprocessingInk" xmlns:wne="http://schemas.microsoft.com/office/word/2006/wordml" xmlns:wps="http://schemas.microsoft.com/office/word/2010/wordprocessingShape" mc:Ignorable="w14 w15 w16se w16cid w16 w16cex w16sdtdh w16sdtfl w16du wp14">
   <w:abstractNum w:abstractNumId="0" w15:restartNumberingAfterBreak="0">
+    <w:nsid w:val="00000001"/>
+    <w:multiLevelType w:val="multilevel"/>
+    <w:tmpl w:val="53970EA7"/>
+    <w:lvl w:ilvl="0">
+      <w:start w:val="3"/>
+      <w:numFmt w:val="bullet"/>
+      <w:lvlText w:val="-"/>
+      <w:lvlJc w:val="left"/>
+      <w:pPr>
+        <w:ind w:left="720" w:hanging="360"/>
+      </w:pPr>
+      <w:rPr>
+        <w:rFonts w:ascii="Times New Roman" w:eastAsia="Times New Roman" w:hAnsi="Times New Roman" w:cs="Times New Roman" w:hint="default"/>
+      </w:rPr>
+    </w:lvl>
+    <w:lvl w:ilvl="1">
+      <w:start w:val="1"/>
+      <w:numFmt w:val="bullet"/>
+      <w:lvlText w:val="o"/>
+      <w:lvlJc w:val="left"/>
+      <w:pPr>
+        <w:ind w:left="1440" w:hanging="360"/>
+      </w:pPr>
+      <w:rPr>
+        <w:rFonts w:ascii="Courier New" w:hAnsi="Courier New" w:cs="Courier New" w:hint="default"/>
+      </w:rPr>
+    </w:lvl>
+    <w:lvl w:ilvl="2">
+      <w:start w:val="1"/>
+      <w:numFmt w:val="bullet"/>
+      <w:lvlText w:val=""/>
+      <w:lvlJc w:val="left"/>
+      <w:pPr>
+        <w:ind w:left="2160" w:hanging="360"/>
+      </w:pPr>
+      <w:rPr>
+        <w:rFonts w:ascii="Wingdings" w:hAnsi="Wingdings" w:hint="default"/>
+      </w:rPr>
+    </w:lvl>
+    <w:lvl w:ilvl="3">
+      <w:start w:val="1"/>
+      <w:numFmt w:val="bullet"/>
+      <w:lvlText w:val=""/>
+      <w:lvlJc w:val="left"/>
+      <w:pPr>
+        <w:ind w:left="2880" w:hanging="360"/>
+      </w:pPr>
+      <w:rPr>
+        <w:rFonts w:ascii="Symbol" w:hAnsi="Symbol" w:hint="default"/>
+      </w:rPr>
+    </w:lvl>
+    <w:lvl w:ilvl="4">
+      <w:start w:val="1"/>
+      <w:numFmt w:val="bullet"/>
+      <w:lvlText w:val="o"/>
+      <w:lvlJc w:val="left"/>
+      <w:pPr>
+        <w:ind w:left="3600" w:hanging="360"/>
+      </w:pPr>
+      <w:rPr>
+        <w:rFonts w:ascii="Courier New" w:hAnsi="Courier New" w:cs="Courier New" w:hint="default"/>
+      </w:rPr>
+    </w:lvl>
+    <w:lvl w:ilvl="5">
+      <w:start w:val="1"/>
+      <w:numFmt w:val="bullet"/>
+      <w:lvlText w:val=""/>
+      <w:lvlJc w:val="left"/>
+      <w:pPr>
+        <w:ind w:left="4320" w:hanging="360"/>
+      </w:pPr>
+      <w:rPr>
+        <w:rFonts w:ascii="Wingdings" w:hAnsi="Wingdings" w:hint="default"/>
+      </w:rPr>
+    </w:lvl>
+    <w:lvl w:ilvl="6">
+      <w:start w:val="1"/>
+      <w:numFmt w:val="bullet"/>
+      <w:lvlText w:val=""/>
+      <w:lvlJc w:val="left"/>
+      <w:pPr>
+        <w:ind w:left="5040" w:hanging="360"/>
+      </w:pPr>
+      <w:rPr>
+        <w:rFonts w:ascii="Symbol" w:hAnsi="Symbol" w:hint="default"/>
+      </w:rPr>
+    </w:lvl>
+    <w:lvl w:ilvl="7">
+      <w:start w:val="1"/>
+      <w:numFmt w:val="bullet"/>
+      <w:lvlText w:val="o"/>
+      <w:lvlJc w:val="left"/>
+      <w:pPr>
+        <w:ind w:left="5760" w:hanging="360"/>
+      </w:pPr>
+      <w:rPr>
+        <w:rFonts w:ascii="Courier New" w:hAnsi="Courier New" w:cs="Courier New" w:hint="default"/>
+      </w:rPr>
+    </w:lvl>
+    <w:lvl w:ilvl="8">
+      <w:start w:val="1"/>
+      <w:numFmt w:val="bullet"/>
+      <w:lvlText w:val=""/>
+      <w:lvlJc w:val="left"/>
+      <w:pPr>
+        <w:ind w:left="6480" w:hanging="360"/>
+      </w:pPr>
+      <w:rPr>
+        <w:rFonts w:ascii="Wingdings" w:hAnsi="Wingdings" w:hint="default"/>
+      </w:rPr>
+    </w:lvl>
+  </w:abstractNum>
+  <w:abstractNum w:abstractNumId="1" w15:restartNumberingAfterBreak="0">
+    <w:nsid w:val="00000002"/>
+    <w:multiLevelType w:val="multilevel"/>
+    <w:tmpl w:val="6E0B66EB"/>
+    <w:lvl w:ilvl="0">
+      <w:start w:val="2"/>
+      <w:numFmt w:val="bullet"/>
+      <w:lvlText w:val="-"/>
+      <w:lvlJc w:val="left"/>
+      <w:pPr>
+        <w:ind w:left="720" w:hanging="360"/>
+      </w:pPr>
+      <w:rPr>
+        <w:rFonts w:ascii="Times New Roman" w:eastAsia="Times New Roman" w:hAnsi="Times New Roman" w:cs="Times New Roman" w:hint="default"/>
+      </w:rPr>
+    </w:lvl>
+    <w:lvl w:ilvl="1">
+      <w:start w:val="1"/>
+      <w:numFmt w:val="bullet"/>
+      <w:lvlText w:val="o"/>
+      <w:lvlJc w:val="left"/>
+      <w:pPr>
+        <w:ind w:left="1440" w:hanging="360"/>
+      </w:pPr>
+      <w:rPr>
+        <w:rFonts w:ascii="Courier New" w:hAnsi="Courier New" w:cs="Courier New" w:hint="default"/>
+      </w:rPr>
+    </w:lvl>
+    <w:lvl w:ilvl="2">
+      <w:start w:val="1"/>
+      <w:numFmt w:val="bullet"/>
+      <w:lvlText w:val=""/>
+      <w:lvlJc w:val="left"/>
+      <w:pPr>
+        <w:ind w:left="2160" w:hanging="360"/>
+      </w:pPr>
+      <w:rPr>
+        <w:rFonts w:ascii="Wingdings" w:hAnsi="Wingdings" w:hint="default"/>
+      </w:rPr>
+    </w:lvl>
+    <w:lvl w:ilvl="3">
+      <w:start w:val="1"/>
+      <w:numFmt w:val="bullet"/>
+      <w:lvlText w:val=""/>
+      <w:lvlJc w:val="left"/>
+      <w:pPr>
+        <w:ind w:left="2880" w:hanging="360"/>
+      </w:pPr>
+      <w:rPr>
+        <w:rFonts w:ascii="Symbol" w:hAnsi="Symbol" w:hint="default"/>
+      </w:rPr>
+    </w:lvl>
+    <w:lvl w:ilvl="4">
+      <w:start w:val="1"/>
+      <w:numFmt w:val="bullet"/>
+      <w:lvlText w:val="o"/>
+      <w:lvlJc w:val="left"/>
+      <w:pPr>
+        <w:ind w:left="3600" w:hanging="360"/>
+      </w:pPr>
+      <w:rPr>
+        <w:rFonts w:ascii="Courier New" w:hAnsi="Courier New" w:cs="Courier New" w:hint="default"/>
+      </w:rPr>
+    </w:lvl>
+    <w:lvl w:ilvl="5">
+      <w:start w:val="1"/>
+      <w:numFmt w:val="bullet"/>
+      <w:lvlText w:val=""/>
+      <w:lvlJc w:val="left"/>
+      <w:pPr>
+        <w:ind w:left="4320" w:hanging="360"/>
+      </w:pPr>
+      <w:rPr>
+        <w:rFonts w:ascii="Wingdings" w:hAnsi="Wingdings" w:hint="default"/>
+      </w:rPr>
+    </w:lvl>
+    <w:lvl w:ilvl="6">
+      <w:start w:val="1"/>
+      <w:numFmt w:val="bullet"/>
+      <w:lvlText w:val=""/>
+      <w:lvlJc w:val="left"/>
+      <w:pPr>
+        <w:ind w:left="5040" w:hanging="360"/>
+      </w:pPr>
+      <w:rPr>
+        <w:rFonts w:ascii="Symbol" w:hAnsi="Symbol" w:hint="default"/>
+      </w:rPr>
+    </w:lvl>
+    <w:lvl w:ilvl="7">
+      <w:start w:val="1"/>
+      <w:numFmt w:val="bullet"/>
+      <w:lvlText w:val="o"/>
+      <w:lvlJc w:val="left"/>
+      <w:pPr>
+        <w:ind w:left="5760" w:hanging="360"/>
+      </w:pPr>
+      <w:rPr>
+        <w:rFonts w:ascii="Courier New" w:hAnsi="Courier New" w:cs="Courier New" w:hint="default"/>
+      </w:rPr>
+    </w:lvl>
+    <w:lvl w:ilvl="8">
+      <w:start w:val="1"/>
+      <w:numFmt w:val="bullet"/>
+      <w:lvlText w:val=""/>
+      <w:lvlJc w:val="left"/>
+      <w:pPr>
+        <w:ind w:left="6480" w:hanging="360"/>
+      </w:pPr>
+      <w:rPr>
+        <w:rFonts w:ascii="Wingdings" w:hAnsi="Wingdings" w:hint="default"/>
+      </w:rPr>
+    </w:lvl>
+  </w:abstractNum>
+  <w:abstractNum w:abstractNumId="2" w15:restartNumberingAfterBreak="0">
+    <w:nsid w:val="00000003"/>
+    <w:multiLevelType w:val="multilevel"/>
+    <w:tmpl w:val="7B0F3E68"/>
+    <w:lvl w:ilvl="0">
+      <w:start w:val="1"/>
+      <w:numFmt w:val="decimal"/>
+      <w:lvlText w:val="(%1)"/>
+      <w:lvlJc w:val="left"/>
+      <w:pPr>
+        <w:ind w:left="1980" w:hanging="360"/>
+      </w:pPr>
+      <w:rPr>
+        <w:rFonts w:hint="default"/>
+      </w:rPr>
+    </w:lvl>
+    <w:lvl w:ilvl="1">
+      <w:start w:val="1"/>
+      <w:numFmt w:val="lowerLetter"/>
+      <w:lvlText w:val="%2."/>
+      <w:lvlJc w:val="left"/>
+      <w:pPr>
+        <w:ind w:left="2700" w:hanging="360"/>
+      </w:pPr>
+    </w:lvl>
+    <w:lvl w:ilvl="2">
+      <w:start w:val="1"/>
+      <w:numFmt w:val="lowerRoman"/>
+      <w:lvlText w:val="%3."/>
+      <w:lvlJc w:val="right"/>
+      <w:pPr>
+        <w:ind w:left="3420" w:hanging="180"/>
+      </w:pPr>
+    </w:lvl>
+    <w:lvl w:ilvl="3">
+      <w:start w:val="1"/>
+      <w:numFmt w:val="decimal"/>
+      <w:lvlText w:val="%4."/>
+      <w:lvlJc w:val="left"/>
+      <w:pPr>
+        <w:ind w:left="4140" w:hanging="360"/>
+      </w:pPr>
+    </w:lvl>
+    <w:lvl w:ilvl="4">
+      <w:start w:val="1"/>
+      <w:numFmt w:val="lowerLetter"/>
+      <w:lvlText w:val="%5."/>
+      <w:lvlJc w:val="left"/>
+      <w:pPr>
+        <w:ind w:left="4860" w:hanging="360"/>
+      </w:pPr>
+    </w:lvl>
+    <w:lvl w:ilvl="5">
+      <w:start w:val="1"/>
+      <w:numFmt w:val="lowerRoman"/>
+      <w:lvlText w:val="%6."/>
+      <w:lvlJc w:val="right"/>
+      <w:pPr>
+        <w:ind w:left="5580" w:hanging="180"/>
+      </w:pPr>
+    </w:lvl>
+    <w:lvl w:ilvl="6">
+      <w:start w:val="1"/>
+      <w:numFmt w:val="decimal"/>
+      <w:lvlText w:val="%7."/>
+      <w:lvlJc w:val="left"/>
+      <w:pPr>
+        <w:ind w:left="6300" w:hanging="360"/>
+      </w:pPr>
+    </w:lvl>
+    <w:lvl w:ilvl="7">
+      <w:start w:val="1"/>
+      <w:numFmt w:val="lowerLetter"/>
+      <w:lvlText w:val="%8."/>
+      <w:lvlJc w:val="left"/>
+      <w:pPr>
+        <w:ind w:left="7020" w:hanging="360"/>
+      </w:pPr>
+    </w:lvl>
+    <w:lvl w:ilvl="8">
+      <w:start w:val="1"/>
+      <w:numFmt w:val="lowerRoman"/>
+      <w:lvlText w:val="%9."/>
+      <w:lvlJc w:val="right"/>
+      <w:pPr>
+        <w:ind w:left="7740" w:hanging="180"/>
+      </w:pPr>
+    </w:lvl>
+  </w:abstractNum>
+  <w:abstractNum w:abstractNumId="3" w15:restartNumberingAfterBreak="0">
+    <w:nsid w:val="370C1840"/>
     <w:multiLevelType w:val="multilevel"/>
     <w:tmpl w:val="2B3A1163"/>
     <w:lvl w:ilvl="0">
@@ -9544,332 +9945,17 @@
       </w:pPr>
     </w:lvl>
   </w:abstractNum>
-  <w:abstractNum w:abstractNumId="1" w15:restartNumberingAfterBreak="0">
-    <w:nsid w:val="00000001"/>
-    <w:multiLevelType w:val="multilevel"/>
-    <w:tmpl w:val="53970EA7"/>
-    <w:lvl w:ilvl="0">
-      <w:start w:val="3"/>
-      <w:numFmt w:val="bullet"/>
-      <w:lvlText w:val="-"/>
-      <w:lvlJc w:val="left"/>
-      <w:pPr>
-        <w:ind w:left="720" w:hanging="360"/>
-      </w:pPr>
-      <w:rPr>
-        <w:rFonts w:ascii="Times New Roman" w:eastAsia="Times New Roman" w:hAnsi="Times New Roman" w:cs="Times New Roman" w:hint="default"/>
-      </w:rPr>
-    </w:lvl>
-    <w:lvl w:ilvl="1">
-      <w:start w:val="1"/>
-      <w:numFmt w:val="bullet"/>
-      <w:lvlText w:val="o"/>
-      <w:lvlJc w:val="left"/>
-      <w:pPr>
-        <w:ind w:left="1440" w:hanging="360"/>
-      </w:pPr>
-      <w:rPr>
-        <w:rFonts w:ascii="Courier New" w:hAnsi="Courier New" w:cs="Courier New" w:hint="default"/>
-      </w:rPr>
-    </w:lvl>
-    <w:lvl w:ilvl="2">
-      <w:start w:val="1"/>
-      <w:numFmt w:val="bullet"/>
-      <w:lvlText w:val=""/>
-      <w:lvlJc w:val="left"/>
-      <w:pPr>
-        <w:ind w:left="2160" w:hanging="360"/>
-      </w:pPr>
-      <w:rPr>
-        <w:rFonts w:ascii="Wingdings" w:hAnsi="Wingdings" w:hint="default"/>
-      </w:rPr>
-    </w:lvl>
-    <w:lvl w:ilvl="3">
-      <w:start w:val="1"/>
-      <w:numFmt w:val="bullet"/>
-      <w:lvlText w:val=""/>
-      <w:lvlJc w:val="left"/>
-      <w:pPr>
-        <w:ind w:left="2880" w:hanging="360"/>
-      </w:pPr>
-      <w:rPr>
-        <w:rFonts w:ascii="Symbol" w:hAnsi="Symbol" w:hint="default"/>
-      </w:rPr>
-    </w:lvl>
-    <w:lvl w:ilvl="4">
-      <w:start w:val="1"/>
-      <w:numFmt w:val="bullet"/>
-      <w:lvlText w:val="o"/>
-      <w:lvlJc w:val="left"/>
-      <w:pPr>
-        <w:ind w:left="3600" w:hanging="360"/>
-      </w:pPr>
-      <w:rPr>
-        <w:rFonts w:ascii="Courier New" w:hAnsi="Courier New" w:cs="Courier New" w:hint="default"/>
-      </w:rPr>
-    </w:lvl>
-    <w:lvl w:ilvl="5">
-      <w:start w:val="1"/>
-      <w:numFmt w:val="bullet"/>
-      <w:lvlText w:val=""/>
-      <w:lvlJc w:val="left"/>
-      <w:pPr>
-        <w:ind w:left="4320" w:hanging="360"/>
-      </w:pPr>
-      <w:rPr>
-        <w:rFonts w:ascii="Wingdings" w:hAnsi="Wingdings" w:hint="default"/>
-      </w:rPr>
-    </w:lvl>
-    <w:lvl w:ilvl="6">
-      <w:start w:val="1"/>
-      <w:numFmt w:val="bullet"/>
-      <w:lvlText w:val=""/>
-      <w:lvlJc w:val="left"/>
-      <w:pPr>
-        <w:ind w:left="5040" w:hanging="360"/>
-      </w:pPr>
-      <w:rPr>
-        <w:rFonts w:ascii="Symbol" w:hAnsi="Symbol" w:hint="default"/>
-      </w:rPr>
-    </w:lvl>
-    <w:lvl w:ilvl="7">
-      <w:start w:val="1"/>
-      <w:numFmt w:val="bullet"/>
-      <w:lvlText w:val="o"/>
-      <w:lvlJc w:val="left"/>
-      <w:pPr>
-        <w:ind w:left="5760" w:hanging="360"/>
-      </w:pPr>
-      <w:rPr>
-        <w:rFonts w:ascii="Courier New" w:hAnsi="Courier New" w:cs="Courier New" w:hint="default"/>
-      </w:rPr>
-    </w:lvl>
-    <w:lvl w:ilvl="8">
-      <w:start w:val="1"/>
-      <w:numFmt w:val="bullet"/>
-      <w:lvlText w:val=""/>
-      <w:lvlJc w:val="left"/>
-      <w:pPr>
-        <w:ind w:left="6480" w:hanging="360"/>
-      </w:pPr>
-      <w:rPr>
-        <w:rFonts w:ascii="Wingdings" w:hAnsi="Wingdings" w:hint="default"/>
-      </w:rPr>
-    </w:lvl>
-  </w:abstractNum>
-  <w:abstractNum w:abstractNumId="2" w15:restartNumberingAfterBreak="0">
-    <w:nsid w:val="00000002"/>
-    <w:multiLevelType w:val="multilevel"/>
-    <w:tmpl w:val="6E0B66EB"/>
-    <w:lvl w:ilvl="0">
-      <w:start w:val="2"/>
-      <w:numFmt w:val="bullet"/>
-      <w:lvlText w:val="-"/>
-      <w:lvlJc w:val="left"/>
-      <w:pPr>
-        <w:ind w:left="720" w:hanging="360"/>
-      </w:pPr>
-      <w:rPr>
-        <w:rFonts w:ascii="Times New Roman" w:eastAsia="Times New Roman" w:hAnsi="Times New Roman" w:cs="Times New Roman" w:hint="default"/>
-      </w:rPr>
-    </w:lvl>
-    <w:lvl w:ilvl="1">
-      <w:start w:val="1"/>
-      <w:numFmt w:val="bullet"/>
-      <w:lvlText w:val="o"/>
-      <w:lvlJc w:val="left"/>
-      <w:pPr>
-        <w:ind w:left="1440" w:hanging="360"/>
-      </w:pPr>
-      <w:rPr>
-        <w:rFonts w:ascii="Courier New" w:hAnsi="Courier New" w:cs="Courier New" w:hint="default"/>
-      </w:rPr>
-    </w:lvl>
-    <w:lvl w:ilvl="2">
-      <w:start w:val="1"/>
-      <w:numFmt w:val="bullet"/>
-      <w:lvlText w:val=""/>
-      <w:lvlJc w:val="left"/>
-      <w:pPr>
-        <w:ind w:left="2160" w:hanging="360"/>
-      </w:pPr>
-      <w:rPr>
-        <w:rFonts w:ascii="Wingdings" w:hAnsi="Wingdings" w:hint="default"/>
-      </w:rPr>
-    </w:lvl>
-    <w:lvl w:ilvl="3">
-      <w:start w:val="1"/>
-      <w:numFmt w:val="bullet"/>
-      <w:lvlText w:val=""/>
-      <w:lvlJc w:val="left"/>
-      <w:pPr>
-        <w:ind w:left="2880" w:hanging="360"/>
-      </w:pPr>
-      <w:rPr>
-        <w:rFonts w:ascii="Symbol" w:hAnsi="Symbol" w:hint="default"/>
-      </w:rPr>
-    </w:lvl>
-    <w:lvl w:ilvl="4">
-      <w:start w:val="1"/>
-      <w:numFmt w:val="bullet"/>
-      <w:lvlText w:val="o"/>
-      <w:lvlJc w:val="left"/>
-      <w:pPr>
-        <w:ind w:left="3600" w:hanging="360"/>
-      </w:pPr>
-      <w:rPr>
-        <w:rFonts w:ascii="Courier New" w:hAnsi="Courier New" w:cs="Courier New" w:hint="default"/>
-      </w:rPr>
-    </w:lvl>
-    <w:lvl w:ilvl="5">
-      <w:start w:val="1"/>
-      <w:numFmt w:val="bullet"/>
-      <w:lvlText w:val=""/>
-      <w:lvlJc w:val="left"/>
-      <w:pPr>
-        <w:ind w:left="4320" w:hanging="360"/>
-      </w:pPr>
-      <w:rPr>
-        <w:rFonts w:ascii="Wingdings" w:hAnsi="Wingdings" w:hint="default"/>
-      </w:rPr>
-    </w:lvl>
-    <w:lvl w:ilvl="6">
-      <w:start w:val="1"/>
-      <w:numFmt w:val="bullet"/>
-      <w:lvlText w:val=""/>
-      <w:lvlJc w:val="left"/>
-      <w:pPr>
-        <w:ind w:left="5040" w:hanging="360"/>
-      </w:pPr>
-      <w:rPr>
-        <w:rFonts w:ascii="Symbol" w:hAnsi="Symbol" w:hint="default"/>
-      </w:rPr>
-    </w:lvl>
-    <w:lvl w:ilvl="7">
-      <w:start w:val="1"/>
-      <w:numFmt w:val="bullet"/>
-      <w:lvlText w:val="o"/>
-      <w:lvlJc w:val="left"/>
-      <w:pPr>
-        <w:ind w:left="5760" w:hanging="360"/>
-      </w:pPr>
-      <w:rPr>
-        <w:rFonts w:ascii="Courier New" w:hAnsi="Courier New" w:cs="Courier New" w:hint="default"/>
-      </w:rPr>
-    </w:lvl>
-    <w:lvl w:ilvl="8">
-      <w:start w:val="1"/>
-      <w:numFmt w:val="bullet"/>
-      <w:lvlText w:val=""/>
-      <w:lvlJc w:val="left"/>
-      <w:pPr>
-        <w:ind w:left="6480" w:hanging="360"/>
-      </w:pPr>
-      <w:rPr>
-        <w:rFonts w:ascii="Wingdings" w:hAnsi="Wingdings" w:hint="default"/>
-      </w:rPr>
-    </w:lvl>
-  </w:abstractNum>
-  <w:abstractNum w:abstractNumId="3" w15:restartNumberingAfterBreak="0">
-    <w:nsid w:val="00000003"/>
-    <w:multiLevelType w:val="multilevel"/>
-    <w:tmpl w:val="7B0F3E68"/>
-    <w:lvl w:ilvl="0">
-      <w:start w:val="1"/>
-      <w:numFmt w:val="decimal"/>
-      <w:lvlText w:val="(%1)"/>
-      <w:lvlJc w:val="left"/>
-      <w:pPr>
-        <w:ind w:left="1980" w:hanging="360"/>
-      </w:pPr>
-      <w:rPr>
-        <w:rFonts w:hint="default"/>
-      </w:rPr>
-    </w:lvl>
-    <w:lvl w:ilvl="1">
-      <w:start w:val="1"/>
-      <w:numFmt w:val="lowerLetter"/>
-      <w:lvlText w:val="%2."/>
-      <w:lvlJc w:val="left"/>
-      <w:pPr>
-        <w:ind w:left="2700" w:hanging="360"/>
-      </w:pPr>
-    </w:lvl>
-    <w:lvl w:ilvl="2">
-      <w:start w:val="1"/>
-      <w:numFmt w:val="lowerRoman"/>
-      <w:lvlText w:val="%3."/>
-      <w:lvlJc w:val="right"/>
-      <w:pPr>
-        <w:ind w:left="3420" w:hanging="180"/>
-      </w:pPr>
-    </w:lvl>
-    <w:lvl w:ilvl="3">
-      <w:start w:val="1"/>
-      <w:numFmt w:val="decimal"/>
-      <w:lvlText w:val="%4."/>
-      <w:lvlJc w:val="left"/>
-      <w:pPr>
-        <w:ind w:left="4140" w:hanging="360"/>
-      </w:pPr>
-    </w:lvl>
-    <w:lvl w:ilvl="4">
-      <w:start w:val="1"/>
-      <w:numFmt w:val="lowerLetter"/>
-      <w:lvlText w:val="%5."/>
-      <w:lvlJc w:val="left"/>
-      <w:pPr>
-        <w:ind w:left="4860" w:hanging="360"/>
-      </w:pPr>
-    </w:lvl>
-    <w:lvl w:ilvl="5">
-      <w:start w:val="1"/>
-      <w:numFmt w:val="lowerRoman"/>
-      <w:lvlText w:val="%6."/>
-      <w:lvlJc w:val="right"/>
-      <w:pPr>
-        <w:ind w:left="5580" w:hanging="180"/>
-      </w:pPr>
-    </w:lvl>
-    <w:lvl w:ilvl="6">
-      <w:start w:val="1"/>
-      <w:numFmt w:val="decimal"/>
-      <w:lvlText w:val="%7."/>
-      <w:lvlJc w:val="left"/>
-      <w:pPr>
-        <w:ind w:left="6300" w:hanging="360"/>
-      </w:pPr>
-    </w:lvl>
-    <w:lvl w:ilvl="7">
-      <w:start w:val="1"/>
-      <w:numFmt w:val="lowerLetter"/>
-      <w:lvlText w:val="%8."/>
-      <w:lvlJc w:val="left"/>
-      <w:pPr>
-        <w:ind w:left="7020" w:hanging="360"/>
-      </w:pPr>
-    </w:lvl>
-    <w:lvl w:ilvl="8">
-      <w:start w:val="1"/>
-      <w:numFmt w:val="lowerRoman"/>
-      <w:lvlText w:val="%9."/>
-      <w:lvlJc w:val="right"/>
-      <w:pPr>
-        <w:ind w:left="7740" w:hanging="180"/>
-      </w:pPr>
-    </w:lvl>
-  </w:abstractNum>
   <w:num w:numId="1" w16cid:durableId="624119250">
+    <w:abstractNumId w:val="3"/>
+  </w:num>
+  <w:num w:numId="2" w16cid:durableId="439765523">
     <w:abstractNumId w:val="0"/>
   </w:num>
-  <w:num w:numId="2" w16cid:durableId="439765523">
+  <w:num w:numId="3" w16cid:durableId="2146465673">
     <w:abstractNumId w:val="1"/>
   </w:num>
-  <w:num w:numId="3" w16cid:durableId="2146465673">
+  <w:num w:numId="4" w16cid:durableId="1971201857">
     <w:abstractNumId w:val="2"/>
-  </w:num>
-  <w:num w:numId="4" w16cid:durableId="1971201857">
-    <w:abstractNumId w:val="3"/>
   </w:num>
 </w:numbering>
 </file>

</xml_diff>